<commit_message>
Update IEEE ACE Research Paper with comprehensive 12-section version aligned with published paper
</commit_message>
<xml_diff>
--- a/docs/IEEE_ACE_Research_Paper.docx
+++ b/docs/IEEE_ACE_Research_Paper.docx
@@ -12,7 +12,7 @@
           <w:b/>
           <w:sz w:val="48"/>
         </w:rPr>
-        <w:t>Adaptive Confidence Engine for Energy-Efficient Multimodal Plastic Waste Sorting Using Cascaded NIR/MIR Spectral Sensing</w:t>
+        <w:t>Adaptive Confidence Engine for Energy-Efficient Multimodal Plastic Waste Sorting Using Cascaded NIR/MIR Spectral Sensing and Deep Learning</w:t>
       </w:r>
     </w:p>
     <w:p>
@@ -30,29 +30,21 @@
       </w:r>
     </w:p>
     <w:p>
-      <w:pPr>
-        <w:jc w:val="center"/>
-      </w:pPr>
       <w:r>
         <w:rPr>
           <w:rFonts w:ascii="Times New Roman" w:hAnsi="Times New Roman"/>
           <w:b/>
           <w:sz w:val="20"/>
         </w:rPr>
-        <w:t>Abstract</w:t>
+        <w:t xml:space="preserve">KEYWORDS: </w:t>
       </w:r>
-    </w:p>
-    <w:p>
-      <w:pPr>
-        <w:jc w:val="both"/>
-      </w:pPr>
       <w:r>
         <w:rPr>
           <w:rFonts w:ascii="Times New Roman" w:hAnsi="Times New Roman"/>
           <w:i/>
           <w:sz w:val="20"/>
         </w:rPr>
-        <w:t>The global waste problem is escalating, with projections of 3.40 billion tonnes by 2050. This paper presents a system that integrates YOLOv11 deep learning with cascaded NIR/MIR spectral sensing. We introduce the Adaptive Confidence Engine (ACE) — an XGBoost model operating on a 17-dimensional context vector. ACE replaces the conventional fixed 0.85 confidence threshold with an adaptive per-item threshold: T = 0.70 + 0.25 × P(MIR_needed). Additionally, an Expected Failure Predictor (EFP) proactively routes carbon-black plastics to MIR using exclusively visual features. Results demonstrate a 31.60 pp reduction in MIR activations, 45.6% energy savings, a 4.5% throughput improvement, and zero missed escalations. The NIR SVM achieves 97.12% accuracy; the MIR Random Forest achieves 100% accuracy on lab samples. The pipeline latency is 39.11 ms per item, with 234.5 MB peak VRAM.</w:t>
+        <w:t>Waste Segregation, Deep Learning, Computer Vision, YOLOv11, Near-Infrared, Mid-Infrared, Adaptive Confidence Engine, XGBoost, Sensor Fusion, Real-time Processing</w:t>
       </w:r>
     </w:p>
     <w:p>
@@ -78,7 +70,7 @@
           <w:i w:val="0"/>
           <w:sz w:val="20"/>
         </w:rPr>
-        <w:t>The global waste crisis is expected to reach 3.40 billion tonnes by 2050 [1]. Manual sorting is labor-intensive, hazardous, and error-prone. Deep learning (CNNs, YOLO) enables automated visual sorting [2][3][4][5]. However, RGB vision cannot distinguish visually identical polymers (e.g., PET vs PVC). NIR spectroscopy solves polymer ID [6][7][8][9] but fails on carbon-black plastics [10][11]. MIR/FTIR identifies black plastics [12] but is expensive and slow. Prior systems use a FIXED confidence threshold (typically 0.85) to decide NIR to MIR escalation. The problem is that a fixed threshold causes excessive MIR activations (69.22% in our baseline). Our contribution is the Adaptive Confidence Engine (ACE) that learns per-item optimal thresholds. The four main contributions are: 1) ACE with a 17-dimensional context vector and adaptive threshold formula. 2) Expected Failure Predictor for proactive carbon-black bypass. 3) Closed-loop feedback database for continuous learning. 4) Comprehensive experimental evaluation showing 45.6% energy savings.</w:t>
+        <w:t>The global waste problem is escalating at an unprecedented rate, with projections indicating a generation of 3.40 billion tonnes by 2050 [34]. Alarmingly, 8 million tonnes of plastic enter the oceans annually, highlighting the critical relevance of Sustainable Development Goals (SDG) 12 and 14 [39][40]. Manual sorting is fraught with limitations, being labor-intensive, hazardous, and error-prone. However, the deep learning revolution, spearheaded by CNNs [35][36] and YOLO architectures [37][38], has enabled automated visual sorting. While NIR spectroscopy is a staple for polymer identification [10][19][20], it inherently fails on carbon-black plastics [10][11]. Conversely, MIR/FTIR successfully identifies black plastics [12][22][23][24], yet its application is hindered by high costs and slow processing speeds. A significant gap exists as all prior systems rely on FIXED confidence thresholds for sensor escalation. Our work bridges this gap through five key contributions: 1) The Adaptive Confidence Engine (ACE) utilizing a 17-dimensional context vector. 2) An Expected Failure Predictor (EFP) designed for proactive carbon-black bypass. 3) A dual-stage YOLOv11 vision pipeline. 4) A closed-loop feedback database to facilitate continuous learning. 5) A comprehensive evaluation demonstrating 45.6% energy savings and a 4.5% throughput gain.</w:t>
       </w:r>
     </w:p>
     <w:p>
@@ -95,6 +87,17 @@
       </w:r>
     </w:p>
     <w:p>
+      <w:r>
+        <w:rPr>
+          <w:rFonts w:ascii="Times New Roman" w:hAnsi="Times New Roman"/>
+          <w:b/>
+          <w:i/>
+          <w:sz w:val="22"/>
+        </w:rPr>
+        <w:t>A. Computer Vision for Waste Sorting</w:t>
+      </w:r>
+    </w:p>
+    <w:p>
       <w:pPr>
         <w:jc w:val="both"/>
       </w:pPr>
@@ -104,7 +107,127 @@
           <w:i w:val="0"/>
           <w:sz w:val="20"/>
         </w:rPr>
-        <w:t>Computer vision for waste sorting utilizes CNNs [2][3] and YOLO variants [4][5]. NIR spectroscopy is widely used for polymer identification [6][7][8][9], but faces the carbon-black problem [10][11]. MIR/FTIR is effective for black plastics [12]. Existing dual-sensor systems use fixed thresholds, and no adaptive confidence gating exists in literature. There is a gap as no system combines vision, dual spectral sensing, an adaptive ML-driven threshold, and proactive failure prediction.</w:t>
+        <w:t>Computer vision approaches have evolved significantly, beginning with fundamental studies by Thung &amp; Yang [1] and the introduction of the TrashNet dataset [3]. Subsequent advancements include Olugboja's deep learning approach [4], the comprehensive critical review by Lu &amp; Chen [5], and modern large-scale datasets such as ZeroWaste [16], TACO [17], Waste Detection in Pomerania [18], and Krizhevsky's RealWaste [15].</w:t>
+      </w:r>
+    </w:p>
+    <w:p>
+      <w:r>
+        <w:rPr>
+          <w:rFonts w:ascii="Times New Roman" w:hAnsi="Times New Roman"/>
+          <w:b/>
+          <w:i/>
+          <w:sz w:val="22"/>
+        </w:rPr>
+        <w:t>B. NIR Spectroscopy</w:t>
+      </w:r>
+    </w:p>
+    <w:p>
+      <w:pPr>
+        <w:jc w:val="both"/>
+      </w:pPr>
+      <w:r>
+        <w:rPr>
+          <w:rFonts w:ascii="Times New Roman" w:hAnsi="Times New Roman"/>
+          <w:i w:val="0"/>
+          <w:sz w:val="20"/>
+        </w:rPr>
+        <w:t>NIR spectroscopy is extensively documented for polymer identification, with notable contributions from Signoroni [19] and Henriksen [20]. Research by Küppers [27] also highlights the significant influence of surface contamination on NIR-based plastic identification.</w:t>
+      </w:r>
+    </w:p>
+    <w:p>
+      <w:r>
+        <w:rPr>
+          <w:rFonts w:ascii="Times New Roman" w:hAnsi="Times New Roman"/>
+          <w:b/>
+          <w:i/>
+          <w:sz w:val="22"/>
+        </w:rPr>
+        <w:t>C. Black Plastic Problem</w:t>
+      </w:r>
+    </w:p>
+    <w:p>
+      <w:pPr>
+        <w:jc w:val="both"/>
+      </w:pPr>
+      <w:r>
+        <w:rPr>
+          <w:rFonts w:ascii="Times New Roman" w:hAnsi="Times New Roman"/>
+          <w:i w:val="0"/>
+          <w:sz w:val="20"/>
+        </w:rPr>
+        <w:t>The challenge of sorting black plastics is well-established by Feldhoff [10] and Serranti [11]. Various spectroscopic alternatives have been explored, including MWIR by Koinig [22], multisensor fusion by Friedl [23], Raman spectroscopy by Brunner [24], and comprehensive HSI reviews by Bonifazi [25].</w:t>
+      </w:r>
+    </w:p>
+    <w:p>
+      <w:r>
+        <w:rPr>
+          <w:rFonts w:ascii="Times New Roman" w:hAnsi="Times New Roman"/>
+          <w:b/>
+          <w:i/>
+          <w:sz w:val="22"/>
+        </w:rPr>
+        <w:t>D. Multimodal Sensor Fusion</w:t>
+      </w:r>
+    </w:p>
+    <w:p>
+      <w:pPr>
+        <w:jc w:val="both"/>
+      </w:pPr>
+      <w:r>
+        <w:rPr>
+          <w:rFonts w:ascii="Times New Roman" w:hAnsi="Times New Roman"/>
+          <w:i w:val="0"/>
+          <w:sz w:val="20"/>
+        </w:rPr>
+        <w:t>Multimodal sensor fusion offers enhanced sorting accuracy. Key frameworks include Gruber's sensor fusion [29], Edmunds' combination of RGB, Thermal, and NIR [31], and Hollstein's integration of NIR and high-speed imaging [32]. Recent advances leverage Cross-Modal Swin Transformers [30] and attention-guided multimodal deep learning [33].</w:t>
+      </w:r>
+    </w:p>
+    <w:p>
+      <w:r>
+        <w:rPr>
+          <w:rFonts w:ascii="Times New Roman" w:hAnsi="Times New Roman"/>
+          <w:b/>
+          <w:i/>
+          <w:sz w:val="22"/>
+        </w:rPr>
+        <w:t>E. Industrial Robotic Sorting</w:t>
+      </w:r>
+    </w:p>
+    <w:p>
+      <w:pPr>
+        <w:jc w:val="both"/>
+      </w:pPr>
+      <w:r>
+        <w:rPr>
+          <w:rFonts w:ascii="Times New Roman" w:hAnsi="Times New Roman"/>
+          <w:i w:val="0"/>
+          <w:sz w:val="20"/>
+        </w:rPr>
+        <w:t>The translation of these technologies to industrial applications involves robotic sorting, exemplified by ZenRobotics [41], the digitalization frameworks proposed by Sarc [42], and the automated sorting review by Gundupalli [44].</w:t>
+      </w:r>
+    </w:p>
+    <w:p>
+      <w:r>
+        <w:rPr>
+          <w:rFonts w:ascii="Times New Roman" w:hAnsi="Times New Roman"/>
+          <w:b/>
+          <w:i/>
+          <w:sz w:val="22"/>
+        </w:rPr>
+        <w:t>F. Gap in Existing Literature</w:t>
+      </w:r>
+    </w:p>
+    <w:p>
+      <w:pPr>
+        <w:jc w:val="both"/>
+      </w:pPr>
+      <w:r>
+        <w:rPr>
+          <w:rFonts w:ascii="Times New Roman" w:hAnsi="Times New Roman"/>
+          <w:i w:val="0"/>
+          <w:sz w:val="20"/>
+        </w:rPr>
+        <w:t>Despite these advancements, no existing system combines computer vision, dual spectral sensing, an adaptive ML-driven threshold, and proactive failure prediction in a unified pipeline.</w:t>
       </w:r>
     </w:p>
     <w:p>
@@ -118,19 +241,6 @@
           <w:sz w:val="24"/>
         </w:rPr>
         <w:t>III. SYSTEM ARCHITECTURE</w:t>
-      </w:r>
-    </w:p>
-    <w:p>
-      <w:pPr>
-        <w:jc w:val="both"/>
-      </w:pPr>
-      <w:r>
-        <w:rPr>
-          <w:rFonts w:ascii="Times New Roman" w:hAnsi="Times New Roman"/>
-          <w:i w:val="0"/>
-          <w:sz w:val="20"/>
-        </w:rPr>
-        <w:t>The proposed system features a 5-stage cascaded pipeline.</w:t>
       </w:r>
     </w:p>
     <w:p>
@@ -178,18 +288,7 @@
           <w:rFonts w:ascii="Times New Roman" w:hAnsi="Times New Roman"/>
           <w:sz w:val="20"/>
         </w:rPr>
-        <w:t>Fig. 1. System architecture of the proposed multimodal waste sorting system with Adaptive Confidence Engine.</w:t>
-      </w:r>
-    </w:p>
-    <w:p>
-      <w:r>
-        <w:rPr>
-          <w:rFonts w:ascii="Times New Roman" w:hAnsi="Times New Roman"/>
-          <w:b/>
-          <w:i/>
-          <w:sz w:val="22"/>
-        </w:rPr>
-        <w:t>A. Stage 1: Vision Detection and Macro-Classification</w:t>
+        <w:t>Fig. 1. System architecture of the proposed multimodal waste sorting system.</w:t>
       </w:r>
     </w:p>
     <w:p>
@@ -202,18 +301,20 @@
           <w:i w:val="0"/>
           <w:sz w:val="20"/>
         </w:rPr>
-        <w:t>The system uses a YOLOv11s object detector for 6 macro-classes: Biodegradable, Cardboard, Glass, Metal, Paper, Plastic. Non-plastic items are diverted immediately by a robotic manipulator. Detection mAP@50 is 53.17%, Precision is 60.81%, and Recall is 48.35%. Classification Top-1 accuracy is 95.73%, and Top-5 is 99.67%. The detection latency is 24.96 ms median with Peak VRAM of 234.5 MB, while classification latency is 14.15 ms median with Peak VRAM of 144.6 MB.</w:t>
+        <w:t>A. Stage 1: Vision Detection employs a YOLOv11s model trained on 6 macro-classes, achieving an mAP@50 of 53.17%. B. Stage 2: The Expected Failure Predictor uses a Random Forest trained on 5 vision-only features to route items directly to MIR if the failure probability exceeds 0.60. C. Stage 3: NIR Spectral Sensing utilizes a 232-band sensor classified via an SVM (RBF kernel, C=10, gamma=scale) with 97.12% accuracy. An early-exit condition triggers if reflectance is &lt;0.08. D. Stage 4: The Adaptive Confidence Engine leverages XGBoost on a 17-dimensional context vector to calculate an adaptive threshold: T = 0.70 + 0.25 × P(MIR_needed). E. Stage 5: MIR/FTIR Fallback acts as the final classification layer, using 3736 spectral points and a Random Forest (200 trees) to achieve 100% lab accuracy. F. The Feedback Database relies on SQLite for closed-loop continuous learning. G. A Real-Time UI and Bin Routing module uses OpenCV overlays, operating at 39.1 ms latency (~25 FPS).</w:t>
       </w:r>
     </w:p>
     <w:p>
+      <w:pPr>
+        <w:jc w:val="center"/>
+      </w:pPr>
       <w:r>
         <w:rPr>
           <w:rFonts w:ascii="Times New Roman" w:hAnsi="Times New Roman"/>
           <w:b/>
-          <w:i/>
-          <w:sz w:val="22"/>
+          <w:sz w:val="24"/>
         </w:rPr>
-        <w:t>B. Stage 2: Expected Failure Predictor (EFP)</w:t>
+        <w:t>IV. HARDWARE CONFIGURATION AND SOFTWARE STACK</w:t>
       </w:r>
     </w:p>
     <w:p>
@@ -226,18 +327,20 @@
           <w:i w:val="0"/>
           <w:sz w:val="20"/>
         </w:rPr>
-        <w:t>The EFP utilizes a Random Forest classifier (100 estimators, max_depth=10) that uses exclusively visual and environmental features (no spectral data): 1. rgb_darkness (1 - mean_brightness/255) 2. lighting_lux (ambient illumination) 3. gloss_index (specular highlight pixel ratio) 4. texture_roughness (normalized Laplacian variance) 5. object_size_cm (bounding box estimate). If the failure probability &gt; 0.60, the item bypasses NIR entirely and routes to MIR. This is designed for carbon-black absorbing plastics where NIR is known to fail. It achieves an ROC-AUC of 1.00 on synthetic data and bypasses ~13.8% of items.</w:t>
+        <w:t>The system is developed and trained on an NVIDIA RTX 4050 (6GB VRAM) with CUDA 12.6, targeting deployment on an NVIDIA Jetson AGX Orin. The software stack comprises Python 3.14, PyTorch 2.x, Ultralytics, scikit-learn, XGBoost, OpenCV, scipy, and joblib.</w:t>
       </w:r>
     </w:p>
     <w:p>
+      <w:pPr>
+        <w:jc w:val="center"/>
+      </w:pPr>
       <w:r>
         <w:rPr>
           <w:rFonts w:ascii="Times New Roman" w:hAnsi="Times New Roman"/>
           <w:b/>
-          <w:i/>
-          <w:sz w:val="22"/>
+          <w:sz w:val="24"/>
         </w:rPr>
-        <w:t>C. Stage 3: NIR Spectral Sensing</w:t>
+        <w:t>V. DATASETS AND PREPROCESSING</w:t>
       </w:r>
     </w:p>
     <w:p>
@@ -250,18 +353,20 @@
           <w:i w:val="0"/>
           <w:sz w:val="20"/>
         </w:rPr>
-        <w:t>The NIR spectral sensing covers the 900–1700 nm range with 232-band spectra. An SVM classifier (RBF kernel, C=10.0, γ=scale) categorizes items into 8 output classes: PET, HDPE, PVC, LDPE, PP, PS, ORGANIC, OTHER. The accuracy is 97.12% with a Weighted F1 of 97.11%. An early-exit bypass routes items to MIR immediately if mean NIR reflectance &lt; 0.08. Preprocessing includes StandardScaler normalization.</w:t>
+        <w:t>A. Visual Classification Datasets: Comprises over 10,000 detection and 12,259 classification images, resized to 384x384. B. NIR HSI Preprocessing: Consists of 1,220 subimages from a Specim FX10 camera (64x64x232), spanning 7 classes, normalized using z-score. C. MIR FTIR Preprocessing: Incorporates 2,649 spectra with 3736 wavenumbers, preprocessed via Savitzky-Golay filtering, SNV, and StandardScaler. D. ACE Synthetic Data: Contains 10,000 samples incorporating 15% carbon-black, environmental noise, and 30% edge cases.</w:t>
       </w:r>
     </w:p>
     <w:p>
+      <w:pPr>
+        <w:jc w:val="center"/>
+      </w:pPr>
       <w:r>
         <w:rPr>
           <w:rFonts w:ascii="Times New Roman" w:hAnsi="Times New Roman"/>
           <w:b/>
-          <w:i/>
-          <w:sz w:val="22"/>
+          <w:sz w:val="24"/>
         </w:rPr>
-        <w:t>D. Stage 4: Adaptive Confidence Engine (ACE)</w:t>
+        <w:t>VI. MACHINE LEARNING MODEL SPECIFICATIONS</w:t>
       </w:r>
     </w:p>
     <w:p>
@@ -274,55 +379,7 @@
           <w:i w:val="0"/>
           <w:sz w:val="20"/>
         </w:rPr>
-        <w:t>ACE is an XGBoost classifier (n_estimators=200, max_depth=5, learning_rate=0.05, eval_metric=logloss) for binary classification (1 = MIR needed, 0 = NIR sufficient). It utilizes a 17-dimensional context vector spanning 4 modalities: Spectral (5): nir_confidence, nir_confidence_margin, reflectance_mean, reflectance_variance, spectral_entropy. Visual (4): object_hue_mean, object_value_mean, object_size_px, object_aspect_ratio. Environmental (3): ambient_light_lux, sensor_temperature_c, humidity_pct. System State (5): conveyor_speed_ms, predicted_class_encoded, recent_mir_rate, camera_noise_level, sensor_drift_index. The adaptive threshold formula is: T = T_base + α × P(MIR_needed), where T_base = 0.70 and α = 0.25. The threshold range is [0.70, 0.95]. If NIR_confidence &lt; T, the item is escalated to MIR. Training was performed on 10,000 synthetic samples with physics-based simulation, including 15% carbon-black samples, environmental noise injection, and 30% edge cases near the decision boundary.</w:t>
-      </w:r>
-    </w:p>
-    <w:p>
-      <w:r>
-        <w:rPr>
-          <w:rFonts w:ascii="Times New Roman" w:hAnsi="Times New Roman"/>
-          <w:b/>
-          <w:i/>
-          <w:sz w:val="22"/>
-        </w:rPr>
-        <w:t>E. Stage 5: MIR/FTIR Fallback Sensing</w:t>
-      </w:r>
-    </w:p>
-    <w:p>
-      <w:pPr>
-        <w:jc w:val="both"/>
-      </w:pPr>
-      <w:r>
-        <w:rPr>
-          <w:rFonts w:ascii="Times New Roman" w:hAnsi="Times New Roman"/>
-          <w:i w:val="0"/>
-          <w:sz w:val="20"/>
-        </w:rPr>
-        <w:t>The MIR/FTIR fallback covers the 2.5–25 μm range (399.19–4000.60 cm⁻¹) with 3,736 spectral points and ~0.96 cm⁻¹ resolution. Preprocessing uses a Savitzky-Golay filter (window=15, polyorder=2) followed by SNV normalization and StandardScaler. A Random Forest classifier (200 estimators, max_depth=15) identifies 6 polymer classes: PET, HDPE, PVC, LDPE, PP, PS. Accuracy is 100.00% on laboratory test samples. Note that this is lab-grade accuracy; field performance may vary.</w:t>
-      </w:r>
-    </w:p>
-    <w:p>
-      <w:r>
-        <w:rPr>
-          <w:rFonts w:ascii="Times New Roman" w:hAnsi="Times New Roman"/>
-          <w:b/>
-          <w:i/>
-          <w:sz w:val="22"/>
-        </w:rPr>
-        <w:t>F. Feedback Database</w:t>
-      </w:r>
-    </w:p>
-    <w:p>
-      <w:pPr>
-        <w:jc w:val="both"/>
-      </w:pPr>
-      <w:r>
-        <w:rPr>
-          <w:rFonts w:ascii="Times New Roman" w:hAnsi="Times New Roman"/>
-          <w:i w:val="0"/>
-          <w:sz w:val="20"/>
-        </w:rPr>
-        <w:t>An SQLite-based closed-loop system records features, nir_prediction, ace_threshold, escalated (bool), final_prediction, and correct_class. This enables periodic retraining for site-specific adaptation.</w:t>
+        <w:t>A. NIR SVM: Configured with an RBF kernel, C=10, gamma='scale', using 731 training, 246 validation, and 243 testing samples. B. MIR Random Forest: Employs 200 trees with max_depth=15 and Gini impurity, trained on 1853 samples and tested on 398. C. ACE XGBoost: Uses 200 estimators, max_depth=5, and lr=0.05 for binary classification. It relies on a full 17-feature vector to compute the threshold: T = 0.70 + 0.25 × P(MIR_needed). D. EFP Random Forest: Consists of 100 trees with max_depth=10, utilizing 5 strictly vision-only features. E. Comparative Models: Deep learning alternatives include a 1D-CNN (94.97%) and SpectralTransformer (92.71%), whereas XGBoost achieved 99.75% for MIR.</w:t>
       </w:r>
     </w:p>
     <w:p>
@@ -335,33 +392,7 @@
           <w:b/>
           <w:sz w:val="24"/>
         </w:rPr>
-        <w:t>IV. EXPERIMENTAL SETUP</w:t>
-      </w:r>
-    </w:p>
-    <w:p>
-      <w:pPr>
-        <w:jc w:val="both"/>
-      </w:pPr>
-      <w:r>
-        <w:rPr>
-          <w:rFonts w:ascii="Times New Roman" w:hAnsi="Times New Roman"/>
-          <w:i w:val="0"/>
-          <w:sz w:val="20"/>
-        </w:rPr>
-        <w:t>Training was conducted on an NVIDIA RTX 4050 (6 GB VRAM) with CUDA 12.x. The target deployment is the NVIDIA Jetson AGX Orin (edge). The datasets include 232-band spectra from 900–1700 nm for NIR and 3,736-point FTIR spectra from 2.5–25 μm for MIR. ACE evaluation used 5,000 synthetic test samples (separate seed from training). The fixed threshold baseline was set to 0.85, and conveyor speed was 0.25 m/s.</w:t>
-      </w:r>
-    </w:p>
-    <w:p>
-      <w:pPr>
-        <w:jc w:val="center"/>
-      </w:pPr>
-      <w:r>
-        <w:rPr>
-          <w:rFonts w:ascii="Times New Roman" w:hAnsi="Times New Roman"/>
-          <w:b/>
-          <w:sz w:val="24"/>
-        </w:rPr>
-        <w:t>V. RESULTS AND DISCUSSION</w:t>
+        <w:t>VII. EXPERIMENTAL RESULTS</w:t>
       </w:r>
     </w:p>
     <w:p>
@@ -375,461 +406,19 @@
         <w:t>A. Vision Pipeline Performance</w:t>
       </w:r>
     </w:p>
-    <w:tbl>
-      <w:tblPr>
-        <w:tblStyle w:val="TableGrid"/>
-        <w:tblW w:type="auto" w:w="0"/>
-        <w:tblLook w:firstColumn="1" w:firstRow="1" w:lastColumn="0" w:lastRow="0" w:noHBand="0" w:noVBand="1" w:val="04A0"/>
-      </w:tblPr>
-      <w:tblGrid>
-        <w:gridCol w:w="2880"/>
-        <w:gridCol w:w="2880"/>
-        <w:gridCol w:w="2880"/>
-      </w:tblGrid>
-      <w:tr>
-        <w:tc>
-          <w:tcPr>
-            <w:tcW w:type="dxa" w:w="2880"/>
-          </w:tcPr>
-          <w:p>
-            <w:r>
-              <w:rPr>
-                <w:rFonts w:ascii="Times New Roman" w:hAnsi="Times New Roman"/>
-                <w:b/>
-                <w:sz w:val="18"/>
-              </w:rPr>
-              <w:t>Model</w:t>
-            </w:r>
-          </w:p>
-        </w:tc>
-        <w:tc>
-          <w:tcPr>
-            <w:tcW w:type="dxa" w:w="2880"/>
-          </w:tcPr>
-          <w:p>
-            <w:r>
-              <w:rPr>
-                <w:rFonts w:ascii="Times New Roman" w:hAnsi="Times New Roman"/>
-                <w:b/>
-                <w:sz w:val="18"/>
-              </w:rPr>
-              <w:t>Metric</w:t>
-            </w:r>
-          </w:p>
-        </w:tc>
-        <w:tc>
-          <w:tcPr>
-            <w:tcW w:type="dxa" w:w="2880"/>
-          </w:tcPr>
-          <w:p>
-            <w:r>
-              <w:rPr>
-                <w:rFonts w:ascii="Times New Roman" w:hAnsi="Times New Roman"/>
-                <w:b/>
-                <w:sz w:val="18"/>
-              </w:rPr>
-              <w:t>Value</w:t>
-            </w:r>
-          </w:p>
-        </w:tc>
-      </w:tr>
-      <w:tr>
-        <w:tc>
-          <w:tcPr>
-            <w:tcW w:type="dxa" w:w="2880"/>
-          </w:tcPr>
-          <w:p>
-            <w:r>
-              <w:rPr>
-                <w:rFonts w:ascii="Times New Roman" w:hAnsi="Times New Roman"/>
-                <w:sz w:val="18"/>
-              </w:rPr>
-              <w:t>YOLOv11s Detector</w:t>
-            </w:r>
-          </w:p>
-        </w:tc>
-        <w:tc>
-          <w:tcPr>
-            <w:tcW w:type="dxa" w:w="2880"/>
-          </w:tcPr>
-          <w:p>
-            <w:r>
-              <w:rPr>
-                <w:rFonts w:ascii="Times New Roman" w:hAnsi="Times New Roman"/>
-                <w:sz w:val="18"/>
-              </w:rPr>
-              <w:t>mAP@50</w:t>
-            </w:r>
-          </w:p>
-        </w:tc>
-        <w:tc>
-          <w:tcPr>
-            <w:tcW w:type="dxa" w:w="2880"/>
-          </w:tcPr>
-          <w:p>
-            <w:r>
-              <w:rPr>
-                <w:rFonts w:ascii="Times New Roman" w:hAnsi="Times New Roman"/>
-                <w:sz w:val="18"/>
-              </w:rPr>
-              <w:t>53.17%</w:t>
-            </w:r>
-          </w:p>
-        </w:tc>
-      </w:tr>
-      <w:tr>
-        <w:tc>
-          <w:tcPr>
-            <w:tcW w:type="dxa" w:w="2880"/>
-          </w:tcPr>
-          <w:p>
-            <w:r>
-              <w:rPr>
-                <w:rFonts w:ascii="Times New Roman" w:hAnsi="Times New Roman"/>
-                <w:sz w:val="18"/>
-              </w:rPr>
-              <w:t>YOLOv11s Detector</w:t>
-            </w:r>
-          </w:p>
-        </w:tc>
-        <w:tc>
-          <w:tcPr>
-            <w:tcW w:type="dxa" w:w="2880"/>
-          </w:tcPr>
-          <w:p>
-            <w:r>
-              <w:rPr>
-                <w:rFonts w:ascii="Times New Roman" w:hAnsi="Times New Roman"/>
-                <w:sz w:val="18"/>
-              </w:rPr>
-              <w:t>Precision</w:t>
-            </w:r>
-          </w:p>
-        </w:tc>
-        <w:tc>
-          <w:tcPr>
-            <w:tcW w:type="dxa" w:w="2880"/>
-          </w:tcPr>
-          <w:p>
-            <w:r>
-              <w:rPr>
-                <w:rFonts w:ascii="Times New Roman" w:hAnsi="Times New Roman"/>
-                <w:sz w:val="18"/>
-              </w:rPr>
-              <w:t>60.81%</w:t>
-            </w:r>
-          </w:p>
-        </w:tc>
-      </w:tr>
-      <w:tr>
-        <w:tc>
-          <w:tcPr>
-            <w:tcW w:type="dxa" w:w="2880"/>
-          </w:tcPr>
-          <w:p>
-            <w:r>
-              <w:rPr>
-                <w:rFonts w:ascii="Times New Roman" w:hAnsi="Times New Roman"/>
-                <w:sz w:val="18"/>
-              </w:rPr>
-              <w:t>YOLOv11s Detector</w:t>
-            </w:r>
-          </w:p>
-        </w:tc>
-        <w:tc>
-          <w:tcPr>
-            <w:tcW w:type="dxa" w:w="2880"/>
-          </w:tcPr>
-          <w:p>
-            <w:r>
-              <w:rPr>
-                <w:rFonts w:ascii="Times New Roman" w:hAnsi="Times New Roman"/>
-                <w:sz w:val="18"/>
-              </w:rPr>
-              <w:t>Recall</w:t>
-            </w:r>
-          </w:p>
-        </w:tc>
-        <w:tc>
-          <w:tcPr>
-            <w:tcW w:type="dxa" w:w="2880"/>
-          </w:tcPr>
-          <w:p>
-            <w:r>
-              <w:rPr>
-                <w:rFonts w:ascii="Times New Roman" w:hAnsi="Times New Roman"/>
-                <w:sz w:val="18"/>
-              </w:rPr>
-              <w:t>48.35%</w:t>
-            </w:r>
-          </w:p>
-        </w:tc>
-      </w:tr>
-      <w:tr>
-        <w:tc>
-          <w:tcPr>
-            <w:tcW w:type="dxa" w:w="2880"/>
-          </w:tcPr>
-          <w:p>
-            <w:r>
-              <w:rPr>
-                <w:rFonts w:ascii="Times New Roman" w:hAnsi="Times New Roman"/>
-                <w:sz w:val="18"/>
-              </w:rPr>
-              <w:t>YOLOv11s Detector</w:t>
-            </w:r>
-          </w:p>
-        </w:tc>
-        <w:tc>
-          <w:tcPr>
-            <w:tcW w:type="dxa" w:w="2880"/>
-          </w:tcPr>
-          <w:p>
-            <w:r>
-              <w:rPr>
-                <w:rFonts w:ascii="Times New Roman" w:hAnsi="Times New Roman"/>
-                <w:sz w:val="18"/>
-              </w:rPr>
-              <w:t>Median Latency</w:t>
-            </w:r>
-          </w:p>
-        </w:tc>
-        <w:tc>
-          <w:tcPr>
-            <w:tcW w:type="dxa" w:w="2880"/>
-          </w:tcPr>
-          <w:p>
-            <w:r>
-              <w:rPr>
-                <w:rFonts w:ascii="Times New Roman" w:hAnsi="Times New Roman"/>
-                <w:sz w:val="18"/>
-              </w:rPr>
-              <w:t>24.96 ms</w:t>
-            </w:r>
-          </w:p>
-        </w:tc>
-      </w:tr>
-      <w:tr>
-        <w:tc>
-          <w:tcPr>
-            <w:tcW w:type="dxa" w:w="2880"/>
-          </w:tcPr>
-          <w:p>
-            <w:r>
-              <w:rPr>
-                <w:rFonts w:ascii="Times New Roman" w:hAnsi="Times New Roman"/>
-                <w:sz w:val="18"/>
-              </w:rPr>
-              <w:t>YOLOv11s Detector</w:t>
-            </w:r>
-          </w:p>
-        </w:tc>
-        <w:tc>
-          <w:tcPr>
-            <w:tcW w:type="dxa" w:w="2880"/>
-          </w:tcPr>
-          <w:p>
-            <w:r>
-              <w:rPr>
-                <w:rFonts w:ascii="Times New Roman" w:hAnsi="Times New Roman"/>
-                <w:sz w:val="18"/>
-              </w:rPr>
-              <w:t>Peak VRAM</w:t>
-            </w:r>
-          </w:p>
-        </w:tc>
-        <w:tc>
-          <w:tcPr>
-            <w:tcW w:type="dxa" w:w="2880"/>
-          </w:tcPr>
-          <w:p>
-            <w:r>
-              <w:rPr>
-                <w:rFonts w:ascii="Times New Roman" w:hAnsi="Times New Roman"/>
-                <w:sz w:val="18"/>
-              </w:rPr>
-              <w:t>234.5 MB</w:t>
-            </w:r>
-          </w:p>
-        </w:tc>
-      </w:tr>
-      <w:tr>
-        <w:tc>
-          <w:tcPr>
-            <w:tcW w:type="dxa" w:w="2880"/>
-          </w:tcPr>
-          <w:p>
-            <w:r>
-              <w:rPr>
-                <w:rFonts w:ascii="Times New Roman" w:hAnsi="Times New Roman"/>
-                <w:sz w:val="18"/>
-              </w:rPr>
-              <w:t>YOLOv11s-cls</w:t>
-            </w:r>
-          </w:p>
-        </w:tc>
-        <w:tc>
-          <w:tcPr>
-            <w:tcW w:type="dxa" w:w="2880"/>
-          </w:tcPr>
-          <w:p>
-            <w:r>
-              <w:rPr>
-                <w:rFonts w:ascii="Times New Roman" w:hAnsi="Times New Roman"/>
-                <w:sz w:val="18"/>
-              </w:rPr>
-              <w:t>Top-1 Accuracy</w:t>
-            </w:r>
-          </w:p>
-        </w:tc>
-        <w:tc>
-          <w:tcPr>
-            <w:tcW w:type="dxa" w:w="2880"/>
-          </w:tcPr>
-          <w:p>
-            <w:r>
-              <w:rPr>
-                <w:rFonts w:ascii="Times New Roman" w:hAnsi="Times New Roman"/>
-                <w:sz w:val="18"/>
-              </w:rPr>
-              <w:t>95.73%</w:t>
-            </w:r>
-          </w:p>
-        </w:tc>
-      </w:tr>
-      <w:tr>
-        <w:tc>
-          <w:tcPr>
-            <w:tcW w:type="dxa" w:w="2880"/>
-          </w:tcPr>
-          <w:p>
-            <w:r>
-              <w:rPr>
-                <w:rFonts w:ascii="Times New Roman" w:hAnsi="Times New Roman"/>
-                <w:sz w:val="18"/>
-              </w:rPr>
-              <w:t>YOLOv11s-cls</w:t>
-            </w:r>
-          </w:p>
-        </w:tc>
-        <w:tc>
-          <w:tcPr>
-            <w:tcW w:type="dxa" w:w="2880"/>
-          </w:tcPr>
-          <w:p>
-            <w:r>
-              <w:rPr>
-                <w:rFonts w:ascii="Times New Roman" w:hAnsi="Times New Roman"/>
-                <w:sz w:val="18"/>
-              </w:rPr>
-              <w:t>Top-5 Accuracy</w:t>
-            </w:r>
-          </w:p>
-        </w:tc>
-        <w:tc>
-          <w:tcPr>
-            <w:tcW w:type="dxa" w:w="2880"/>
-          </w:tcPr>
-          <w:p>
-            <w:r>
-              <w:rPr>
-                <w:rFonts w:ascii="Times New Roman" w:hAnsi="Times New Roman"/>
-                <w:sz w:val="18"/>
-              </w:rPr>
-              <w:t>99.67%</w:t>
-            </w:r>
-          </w:p>
-        </w:tc>
-      </w:tr>
-      <w:tr>
-        <w:tc>
-          <w:tcPr>
-            <w:tcW w:type="dxa" w:w="2880"/>
-          </w:tcPr>
-          <w:p>
-            <w:r>
-              <w:rPr>
-                <w:rFonts w:ascii="Times New Roman" w:hAnsi="Times New Roman"/>
-                <w:sz w:val="18"/>
-              </w:rPr>
-              <w:t>YOLOv11s-cls</w:t>
-            </w:r>
-          </w:p>
-        </w:tc>
-        <w:tc>
-          <w:tcPr>
-            <w:tcW w:type="dxa" w:w="2880"/>
-          </w:tcPr>
-          <w:p>
-            <w:r>
-              <w:rPr>
-                <w:rFonts w:ascii="Times New Roman" w:hAnsi="Times New Roman"/>
-                <w:sz w:val="18"/>
-              </w:rPr>
-              <w:t>Median Latency</w:t>
-            </w:r>
-          </w:p>
-        </w:tc>
-        <w:tc>
-          <w:tcPr>
-            <w:tcW w:type="dxa" w:w="2880"/>
-          </w:tcPr>
-          <w:p>
-            <w:r>
-              <w:rPr>
-                <w:rFonts w:ascii="Times New Roman" w:hAnsi="Times New Roman"/>
-                <w:sz w:val="18"/>
-              </w:rPr>
-              <w:t>14.15 ms</w:t>
-            </w:r>
-          </w:p>
-        </w:tc>
-      </w:tr>
-      <w:tr>
-        <w:tc>
-          <w:tcPr>
-            <w:tcW w:type="dxa" w:w="2880"/>
-          </w:tcPr>
-          <w:p>
-            <w:r>
-              <w:rPr>
-                <w:rFonts w:ascii="Times New Roman" w:hAnsi="Times New Roman"/>
-                <w:sz w:val="18"/>
-              </w:rPr>
-              <w:t>YOLOv11s-cls</w:t>
-            </w:r>
-          </w:p>
-        </w:tc>
-        <w:tc>
-          <w:tcPr>
-            <w:tcW w:type="dxa" w:w="2880"/>
-          </w:tcPr>
-          <w:p>
-            <w:r>
-              <w:rPr>
-                <w:rFonts w:ascii="Times New Roman" w:hAnsi="Times New Roman"/>
-                <w:sz w:val="18"/>
-              </w:rPr>
-              <w:t>Peak VRAM</w:t>
-            </w:r>
-          </w:p>
-        </w:tc>
-        <w:tc>
-          <w:tcPr>
-            <w:tcW w:type="dxa" w:w="2880"/>
-          </w:tcPr>
-          <w:p>
-            <w:r>
-              <w:rPr>
-                <w:rFonts w:ascii="Times New Roman" w:hAnsi="Times New Roman"/>
-                <w:sz w:val="18"/>
-              </w:rPr>
-              <w:t>144.6 MB</w:t>
-            </w:r>
-          </w:p>
-        </w:tc>
-      </w:tr>
-    </w:tbl>
+    <w:p>
+      <w:pPr>
+        <w:jc w:val="both"/>
+      </w:pPr>
+      <w:r>
+        <w:rPr>
+          <w:rFonts w:ascii="Times New Roman" w:hAnsi="Times New Roman"/>
+          <w:i w:val="0"/>
+          <w:sz w:val="20"/>
+        </w:rPr>
+        <w:t>The YOLOv11s vision pipeline achieved a Top-1 accuracy of 95.73%, a Top-5 accuracy of 99.67%, and an mAP@50 of 53.17%.</w:t>
+      </w:r>
+    </w:p>
     <w:p>
       <w:r>
         <w:rPr>
@@ -838,7 +427,7 @@
           <w:i/>
           <w:sz w:val="22"/>
         </w:rPr>
-        <w:t>B. Spectral Classifier Comparison</w:t>
+        <w:t>B. NIR Classifier Comparison</w:t>
       </w:r>
     </w:p>
     <w:tbl>
@@ -942,7 +531,7 @@
                 <w:rFonts w:ascii="Times New Roman" w:hAnsi="Times New Roman"/>
                 <w:sz w:val="18"/>
               </w:rPr>
-              <w:t>SVM (Selected)</w:t>
+              <w:t>SVM</w:t>
             </w:r>
           </w:p>
         </w:tc>
@@ -1149,6 +738,17 @@
       </w:tr>
     </w:tbl>
     <w:p/>
+    <w:p>
+      <w:r>
+        <w:rPr>
+          <w:rFonts w:ascii="Times New Roman" w:hAnsi="Times New Roman"/>
+          <w:b/>
+          <w:i/>
+          <w:sz w:val="22"/>
+        </w:rPr>
+        <w:t>C. MIR Classifier Comparison</w:t>
+      </w:r>
+    </w:p>
     <w:tbl>
       <w:tblPr>
         <w:tblStyle w:val="TableGrid"/>
@@ -1250,7 +850,7 @@
                 <w:rFonts w:ascii="Times New Roman" w:hAnsi="Times New Roman"/>
                 <w:sz w:val="18"/>
               </w:rPr>
-              <w:t>Random Forest (Selected)</w:t>
+              <w:t>Random Forest</w:t>
             </w:r>
           </w:p>
         </w:tc>
@@ -1600,6 +1200,7 @@
         </w:tc>
       </w:tr>
     </w:tbl>
+    <w:p/>
     <w:p>
       <w:r>
         <w:rPr>
@@ -1608,7 +1209,7 @@
           <w:i/>
           <w:sz w:val="22"/>
         </w:rPr>
-        <w:t>C. ACE vs Fixed Threshold</w:t>
+        <w:t>D. ACE vs Fixed Threshold</w:t>
       </w:r>
     </w:p>
     <w:tbl>
@@ -2034,19 +1635,7 @@
         </w:tc>
       </w:tr>
     </w:tbl>
-    <w:p>
-      <w:pPr>
-        <w:jc w:val="both"/>
-      </w:pPr>
-      <w:r>
-        <w:rPr>
-          <w:rFonts w:ascii="Times New Roman" w:hAnsi="Times New Roman"/>
-          <w:i w:val="0"/>
-          <w:sz w:val="20"/>
-        </w:rPr>
-        <w:t>Note: Throughput formula = 60 / (base_time + MIR_rate × 0.5). MIR accuracy of 100% is on lab-grade spectra (Serranti et al. 2012 consistent). Field performance may vary. 0.00% missed escalations means ACE identified ALL true failures, reducing only wasteful escalations.</w:t>
-      </w:r>
-    </w:p>
+    <w:p/>
     <w:p>
       <w:r>
         <w:rPr>
@@ -2055,645 +1644,7 @@
           <w:i/>
           <w:sz w:val="22"/>
         </w:rPr>
-        <w:t>D. Edge Deployment Feasibility</w:t>
-      </w:r>
-    </w:p>
-    <w:tbl>
-      <w:tblPr>
-        <w:tblStyle w:val="TableGrid"/>
-        <w:tblW w:type="auto" w:w="0"/>
-        <w:tblLook w:firstColumn="1" w:firstRow="1" w:lastColumn="0" w:lastRow="0" w:noHBand="0" w:noVBand="1" w:val="04A0"/>
-      </w:tblPr>
-      <w:tblGrid>
-        <w:gridCol w:w="1728"/>
-        <w:gridCol w:w="1728"/>
-        <w:gridCol w:w="1728"/>
-        <w:gridCol w:w="1728"/>
-        <w:gridCol w:w="1728"/>
-      </w:tblGrid>
-      <w:tr>
-        <w:tc>
-          <w:tcPr>
-            <w:tcW w:type="dxa" w:w="1728"/>
-          </w:tcPr>
-          <w:p>
-            <w:r>
-              <w:rPr>
-                <w:rFonts w:ascii="Times New Roman" w:hAnsi="Times New Roman"/>
-                <w:b/>
-                <w:sz w:val="18"/>
-              </w:rPr>
-              <w:t>Component</w:t>
-            </w:r>
-          </w:p>
-        </w:tc>
-        <w:tc>
-          <w:tcPr>
-            <w:tcW w:type="dxa" w:w="1728"/>
-          </w:tcPr>
-          <w:p>
-            <w:r>
-              <w:rPr>
-                <w:rFonts w:ascii="Times New Roman" w:hAnsi="Times New Roman"/>
-                <w:b/>
-                <w:sz w:val="18"/>
-              </w:rPr>
-              <w:t>Median Latency</w:t>
-            </w:r>
-          </w:p>
-        </w:tc>
-        <w:tc>
-          <w:tcPr>
-            <w:tcW w:type="dxa" w:w="1728"/>
-          </w:tcPr>
-          <w:p>
-            <w:r>
-              <w:rPr>
-                <w:rFonts w:ascii="Times New Roman" w:hAnsi="Times New Roman"/>
-                <w:b/>
-                <w:sz w:val="18"/>
-              </w:rPr>
-              <w:t>P95 Latency</w:t>
-            </w:r>
-          </w:p>
-        </w:tc>
-        <w:tc>
-          <w:tcPr>
-            <w:tcW w:type="dxa" w:w="1728"/>
-          </w:tcPr>
-          <w:p>
-            <w:r>
-              <w:rPr>
-                <w:rFonts w:ascii="Times New Roman" w:hAnsi="Times New Roman"/>
-                <w:b/>
-                <w:sz w:val="18"/>
-              </w:rPr>
-              <w:t>FPS</w:t>
-            </w:r>
-          </w:p>
-        </w:tc>
-        <w:tc>
-          <w:tcPr>
-            <w:tcW w:type="dxa" w:w="1728"/>
-          </w:tcPr>
-          <w:p>
-            <w:r>
-              <w:rPr>
-                <w:rFonts w:ascii="Times New Roman" w:hAnsi="Times New Roman"/>
-                <w:b/>
-                <w:sz w:val="18"/>
-              </w:rPr>
-              <w:t>Peak VRAM</w:t>
-            </w:r>
-          </w:p>
-        </w:tc>
-      </w:tr>
-      <w:tr>
-        <w:tc>
-          <w:tcPr>
-            <w:tcW w:type="dxa" w:w="1728"/>
-          </w:tcPr>
-          <w:p>
-            <w:r>
-              <w:rPr>
-                <w:rFonts w:ascii="Times New Roman" w:hAnsi="Times New Roman"/>
-                <w:sz w:val="18"/>
-              </w:rPr>
-              <w:t>Detection</w:t>
-            </w:r>
-          </w:p>
-        </w:tc>
-        <w:tc>
-          <w:tcPr>
-            <w:tcW w:type="dxa" w:w="1728"/>
-          </w:tcPr>
-          <w:p>
-            <w:r>
-              <w:rPr>
-                <w:rFonts w:ascii="Times New Roman" w:hAnsi="Times New Roman"/>
-                <w:sz w:val="18"/>
-              </w:rPr>
-              <w:t>24.96 ms</w:t>
-            </w:r>
-          </w:p>
-        </w:tc>
-        <w:tc>
-          <w:tcPr>
-            <w:tcW w:type="dxa" w:w="1728"/>
-          </w:tcPr>
-          <w:p>
-            <w:r>
-              <w:rPr>
-                <w:rFonts w:ascii="Times New Roman" w:hAnsi="Times New Roman"/>
-                <w:sz w:val="18"/>
-              </w:rPr>
-              <w:t>31.06 ms</w:t>
-            </w:r>
-          </w:p>
-        </w:tc>
-        <w:tc>
-          <w:tcPr>
-            <w:tcW w:type="dxa" w:w="1728"/>
-          </w:tcPr>
-          <w:p>
-            <w:r>
-              <w:rPr>
-                <w:rFonts w:ascii="Times New Roman" w:hAnsi="Times New Roman"/>
-                <w:sz w:val="18"/>
-              </w:rPr>
-              <w:t>40.07</w:t>
-            </w:r>
-          </w:p>
-        </w:tc>
-        <w:tc>
-          <w:tcPr>
-            <w:tcW w:type="dxa" w:w="1728"/>
-          </w:tcPr>
-          <w:p>
-            <w:r>
-              <w:rPr>
-                <w:rFonts w:ascii="Times New Roman" w:hAnsi="Times New Roman"/>
-                <w:sz w:val="18"/>
-              </w:rPr>
-              <w:t>234.5 MB</w:t>
-            </w:r>
-          </w:p>
-        </w:tc>
-      </w:tr>
-      <w:tr>
-        <w:tc>
-          <w:tcPr>
-            <w:tcW w:type="dxa" w:w="1728"/>
-          </w:tcPr>
-          <w:p>
-            <w:r>
-              <w:rPr>
-                <w:rFonts w:ascii="Times New Roman" w:hAnsi="Times New Roman"/>
-                <w:sz w:val="18"/>
-              </w:rPr>
-              <w:t>Classification</w:t>
-            </w:r>
-          </w:p>
-        </w:tc>
-        <w:tc>
-          <w:tcPr>
-            <w:tcW w:type="dxa" w:w="1728"/>
-          </w:tcPr>
-          <w:p>
-            <w:r>
-              <w:rPr>
-                <w:rFonts w:ascii="Times New Roman" w:hAnsi="Times New Roman"/>
-                <w:sz w:val="18"/>
-              </w:rPr>
-              <w:t>14.15 ms</w:t>
-            </w:r>
-          </w:p>
-        </w:tc>
-        <w:tc>
-          <w:tcPr>
-            <w:tcW w:type="dxa" w:w="1728"/>
-          </w:tcPr>
-          <w:p>
-            <w:r>
-              <w:rPr>
-                <w:rFonts w:ascii="Times New Roman" w:hAnsi="Times New Roman"/>
-                <w:sz w:val="18"/>
-              </w:rPr>
-              <w:t>16.19 ms</w:t>
-            </w:r>
-          </w:p>
-        </w:tc>
-        <w:tc>
-          <w:tcPr>
-            <w:tcW w:type="dxa" w:w="1728"/>
-          </w:tcPr>
-          <w:p>
-            <w:r>
-              <w:rPr>
-                <w:rFonts w:ascii="Times New Roman" w:hAnsi="Times New Roman"/>
-                <w:sz w:val="18"/>
-              </w:rPr>
-              <w:t>70.68</w:t>
-            </w:r>
-          </w:p>
-        </w:tc>
-        <w:tc>
-          <w:tcPr>
-            <w:tcW w:type="dxa" w:w="1728"/>
-          </w:tcPr>
-          <w:p>
-            <w:r>
-              <w:rPr>
-                <w:rFonts w:ascii="Times New Roman" w:hAnsi="Times New Roman"/>
-                <w:sz w:val="18"/>
-              </w:rPr>
-              <w:t>144.6 MB</w:t>
-            </w:r>
-          </w:p>
-        </w:tc>
-      </w:tr>
-      <w:tr>
-        <w:tc>
-          <w:tcPr>
-            <w:tcW w:type="dxa" w:w="1728"/>
-          </w:tcPr>
-          <w:p>
-            <w:r>
-              <w:rPr>
-                <w:rFonts w:ascii="Times New Roman" w:hAnsi="Times New Roman"/>
-                <w:sz w:val="18"/>
-              </w:rPr>
-              <w:t>Combined Pipeline</w:t>
-            </w:r>
-          </w:p>
-        </w:tc>
-        <w:tc>
-          <w:tcPr>
-            <w:tcW w:type="dxa" w:w="1728"/>
-          </w:tcPr>
-          <w:p>
-            <w:r>
-              <w:rPr>
-                <w:rFonts w:ascii="Times New Roman" w:hAnsi="Times New Roman"/>
-                <w:sz w:val="18"/>
-              </w:rPr>
-              <w:t>39.11 ms</w:t>
-            </w:r>
-          </w:p>
-        </w:tc>
-        <w:tc>
-          <w:tcPr>
-            <w:tcW w:type="dxa" w:w="1728"/>
-          </w:tcPr>
-          <w:p>
-            <w:r>
-              <w:rPr>
-                <w:rFonts w:ascii="Times New Roman" w:hAnsi="Times New Roman"/>
-                <w:sz w:val="18"/>
-              </w:rPr>
-              <w:t>47.25 ms</w:t>
-            </w:r>
-          </w:p>
-        </w:tc>
-        <w:tc>
-          <w:tcPr>
-            <w:tcW w:type="dxa" w:w="1728"/>
-          </w:tcPr>
-          <w:p>
-            <w:r>
-              <w:rPr>
-                <w:rFonts w:ascii="Times New Roman" w:hAnsi="Times New Roman"/>
-                <w:sz w:val="18"/>
-              </w:rPr>
-              <w:t>~25</w:t>
-            </w:r>
-          </w:p>
-        </w:tc>
-        <w:tc>
-          <w:tcPr>
-            <w:tcW w:type="dxa" w:w="1728"/>
-          </w:tcPr>
-          <w:p>
-            <w:r>
-              <w:rPr>
-                <w:rFonts w:ascii="Times New Roman" w:hAnsi="Times New Roman"/>
-                <w:sz w:val="18"/>
-              </w:rPr>
-              <w:t>234.5 MB</w:t>
-            </w:r>
-          </w:p>
-        </w:tc>
-      </w:tr>
-    </w:tbl>
-    <w:p>
-      <w:r>
-        <w:rPr>
-          <w:rFonts w:ascii="Times New Roman" w:hAnsi="Times New Roman"/>
-          <w:b/>
-          <w:i/>
-          <w:sz w:val="22"/>
-        </w:rPr>
-        <w:t>E. Detector Confidence Sweep</w:t>
-      </w:r>
-    </w:p>
-    <w:tbl>
-      <w:tblPr>
-        <w:tblStyle w:val="TableGrid"/>
-        <w:tblW w:type="auto" w:w="0"/>
-        <w:tblLook w:firstColumn="1" w:firstRow="1" w:lastColumn="0" w:lastRow="0" w:noHBand="0" w:noVBand="1" w:val="04A0"/>
-      </w:tblPr>
-      <w:tblGrid>
-        <w:gridCol w:w="2160"/>
-        <w:gridCol w:w="2160"/>
-        <w:gridCol w:w="2160"/>
-        <w:gridCol w:w="2160"/>
-      </w:tblGrid>
-      <w:tr>
-        <w:tc>
-          <w:tcPr>
-            <w:tcW w:type="dxa" w:w="2160"/>
-          </w:tcPr>
-          <w:p>
-            <w:r>
-              <w:rPr>
-                <w:rFonts w:ascii="Times New Roman" w:hAnsi="Times New Roman"/>
-                <w:b/>
-                <w:sz w:val="18"/>
-              </w:rPr>
-              <w:t>Confidence Threshold</w:t>
-            </w:r>
-          </w:p>
-        </w:tc>
-        <w:tc>
-          <w:tcPr>
-            <w:tcW w:type="dxa" w:w="2160"/>
-          </w:tcPr>
-          <w:p>
-            <w:r>
-              <w:rPr>
-                <w:rFonts w:ascii="Times New Roman" w:hAnsi="Times New Roman"/>
-                <w:b/>
-                <w:sz w:val="18"/>
-              </w:rPr>
-              <w:t>Precision</w:t>
-            </w:r>
-          </w:p>
-        </w:tc>
-        <w:tc>
-          <w:tcPr>
-            <w:tcW w:type="dxa" w:w="2160"/>
-          </w:tcPr>
-          <w:p>
-            <w:r>
-              <w:rPr>
-                <w:rFonts w:ascii="Times New Roman" w:hAnsi="Times New Roman"/>
-                <w:b/>
-                <w:sz w:val="18"/>
-              </w:rPr>
-              <w:t>Recall</w:t>
-            </w:r>
-          </w:p>
-        </w:tc>
-        <w:tc>
-          <w:tcPr>
-            <w:tcW w:type="dxa" w:w="2160"/>
-          </w:tcPr>
-          <w:p>
-            <w:r>
-              <w:rPr>
-                <w:rFonts w:ascii="Times New Roman" w:hAnsi="Times New Roman"/>
-                <w:b/>
-                <w:sz w:val="18"/>
-              </w:rPr>
-              <w:t>mAP@50</w:t>
-            </w:r>
-          </w:p>
-        </w:tc>
-      </w:tr>
-      <w:tr>
-        <w:tc>
-          <w:tcPr>
-            <w:tcW w:type="dxa" w:w="2160"/>
-          </w:tcPr>
-          <w:p>
-            <w:r>
-              <w:rPr>
-                <w:rFonts w:ascii="Times New Roman" w:hAnsi="Times New Roman"/>
-                <w:sz w:val="18"/>
-              </w:rPr>
-              <w:t>0.10</w:t>
-            </w:r>
-          </w:p>
-        </w:tc>
-        <w:tc>
-          <w:tcPr>
-            <w:tcW w:type="dxa" w:w="2160"/>
-          </w:tcPr>
-          <w:p>
-            <w:r>
-              <w:rPr>
-                <w:rFonts w:ascii="Times New Roman" w:hAnsi="Times New Roman"/>
-                <w:sz w:val="18"/>
-              </w:rPr>
-              <w:t>60.81%</w:t>
-            </w:r>
-          </w:p>
-        </w:tc>
-        <w:tc>
-          <w:tcPr>
-            <w:tcW w:type="dxa" w:w="2160"/>
-          </w:tcPr>
-          <w:p>
-            <w:r>
-              <w:rPr>
-                <w:rFonts w:ascii="Times New Roman" w:hAnsi="Times New Roman"/>
-                <w:sz w:val="18"/>
-              </w:rPr>
-              <w:t>48.35%</w:t>
-            </w:r>
-          </w:p>
-        </w:tc>
-        <w:tc>
-          <w:tcPr>
-            <w:tcW w:type="dxa" w:w="2160"/>
-          </w:tcPr>
-          <w:p>
-            <w:r>
-              <w:rPr>
-                <w:rFonts w:ascii="Times New Roman" w:hAnsi="Times New Roman"/>
-                <w:sz w:val="18"/>
-              </w:rPr>
-              <w:t>50.10%</w:t>
-            </w:r>
-          </w:p>
-        </w:tc>
-      </w:tr>
-      <w:tr>
-        <w:tc>
-          <w:tcPr>
-            <w:tcW w:type="dxa" w:w="2160"/>
-          </w:tcPr>
-          <w:p>
-            <w:r>
-              <w:rPr>
-                <w:rFonts w:ascii="Times New Roman" w:hAnsi="Times New Roman"/>
-                <w:sz w:val="18"/>
-              </w:rPr>
-              <w:t>0.20</w:t>
-            </w:r>
-          </w:p>
-        </w:tc>
-        <w:tc>
-          <w:tcPr>
-            <w:tcW w:type="dxa" w:w="2160"/>
-          </w:tcPr>
-          <w:p>
-            <w:r>
-              <w:rPr>
-                <w:rFonts w:ascii="Times New Roman" w:hAnsi="Times New Roman"/>
-                <w:sz w:val="18"/>
-              </w:rPr>
-              <w:t>60.81%</w:t>
-            </w:r>
-          </w:p>
-        </w:tc>
-        <w:tc>
-          <w:tcPr>
-            <w:tcW w:type="dxa" w:w="2160"/>
-          </w:tcPr>
-          <w:p>
-            <w:r>
-              <w:rPr>
-                <w:rFonts w:ascii="Times New Roman" w:hAnsi="Times New Roman"/>
-                <w:sz w:val="18"/>
-              </w:rPr>
-              <w:t>48.35%</w:t>
-            </w:r>
-          </w:p>
-        </w:tc>
-        <w:tc>
-          <w:tcPr>
-            <w:tcW w:type="dxa" w:w="2160"/>
-          </w:tcPr>
-          <w:p>
-            <w:r>
-              <w:rPr>
-                <w:rFonts w:ascii="Times New Roman" w:hAnsi="Times New Roman"/>
-                <w:sz w:val="18"/>
-              </w:rPr>
-              <w:t>47.20%</w:t>
-            </w:r>
-          </w:p>
-        </w:tc>
-      </w:tr>
-      <w:tr>
-        <w:tc>
-          <w:tcPr>
-            <w:tcW w:type="dxa" w:w="2160"/>
-          </w:tcPr>
-          <w:p>
-            <w:r>
-              <w:rPr>
-                <w:rFonts w:ascii="Times New Roman" w:hAnsi="Times New Roman"/>
-                <w:sz w:val="18"/>
-              </w:rPr>
-              <w:t>0.30</w:t>
-            </w:r>
-          </w:p>
-        </w:tc>
-        <w:tc>
-          <w:tcPr>
-            <w:tcW w:type="dxa" w:w="2160"/>
-          </w:tcPr>
-          <w:p>
-            <w:r>
-              <w:rPr>
-                <w:rFonts w:ascii="Times New Roman" w:hAnsi="Times New Roman"/>
-                <w:sz w:val="18"/>
-              </w:rPr>
-              <w:t>58.52%</w:t>
-            </w:r>
-          </w:p>
-        </w:tc>
-        <w:tc>
-          <w:tcPr>
-            <w:tcW w:type="dxa" w:w="2160"/>
-          </w:tcPr>
-          <w:p>
-            <w:r>
-              <w:rPr>
-                <w:rFonts w:ascii="Times New Roman" w:hAnsi="Times New Roman"/>
-                <w:sz w:val="18"/>
-              </w:rPr>
-              <w:t>50.48%</w:t>
-            </w:r>
-          </w:p>
-        </w:tc>
-        <w:tc>
-          <w:tcPr>
-            <w:tcW w:type="dxa" w:w="2160"/>
-          </w:tcPr>
-          <w:p>
-            <w:r>
-              <w:rPr>
-                <w:rFonts w:ascii="Times New Roman" w:hAnsi="Times New Roman"/>
-                <w:sz w:val="18"/>
-              </w:rPr>
-              <w:t>44.27%</w:t>
-            </w:r>
-          </w:p>
-        </w:tc>
-      </w:tr>
-      <w:tr>
-        <w:tc>
-          <w:tcPr>
-            <w:tcW w:type="dxa" w:w="2160"/>
-          </w:tcPr>
-          <w:p>
-            <w:r>
-              <w:rPr>
-                <w:rFonts w:ascii="Times New Roman" w:hAnsi="Times New Roman"/>
-                <w:sz w:val="18"/>
-              </w:rPr>
-              <w:t>0.50</w:t>
-            </w:r>
-          </w:p>
-        </w:tc>
-        <w:tc>
-          <w:tcPr>
-            <w:tcW w:type="dxa" w:w="2160"/>
-          </w:tcPr>
-          <w:p>
-            <w:r>
-              <w:rPr>
-                <w:rFonts w:ascii="Times New Roman" w:hAnsi="Times New Roman"/>
-                <w:sz w:val="18"/>
-              </w:rPr>
-              <w:t>69.58%</w:t>
-            </w:r>
-          </w:p>
-        </w:tc>
-        <w:tc>
-          <w:tcPr>
-            <w:tcW w:type="dxa" w:w="2160"/>
-          </w:tcPr>
-          <w:p>
-            <w:r>
-              <w:rPr>
-                <w:rFonts w:ascii="Times New Roman" w:hAnsi="Times New Roman"/>
-                <w:sz w:val="18"/>
-              </w:rPr>
-              <w:t>41.27%</w:t>
-            </w:r>
-          </w:p>
-        </w:tc>
-        <w:tc>
-          <w:tcPr>
-            <w:tcW w:type="dxa" w:w="2160"/>
-          </w:tcPr>
-          <w:p>
-            <w:r>
-              <w:rPr>
-                <w:rFonts w:ascii="Times New Roman" w:hAnsi="Times New Roman"/>
-                <w:sz w:val="18"/>
-              </w:rPr>
-              <w:t>37.22%</w:t>
-            </w:r>
-          </w:p>
-        </w:tc>
-      </w:tr>
-    </w:tbl>
-    <w:p>
-      <w:pPr>
-        <w:jc w:val="center"/>
-      </w:pPr>
-      <w:r>
-        <w:rPr>
-          <w:rFonts w:ascii="Times New Roman" w:hAnsi="Times New Roman"/>
-          <w:b/>
-          <w:sz w:val="24"/>
-        </w:rPr>
-        <w:t>VI. ABLATION STUDY</w:t>
+        <w:t>E. Edge Deployment Benchmark</w:t>
       </w:r>
     </w:p>
     <w:p>
@@ -2706,7 +1657,31 @@
           <w:i w:val="0"/>
           <w:sz w:val="20"/>
         </w:rPr>
-        <w:t>The contribution of each component is as follows: 1. Vision-only (no spectral): Cannot distinguish polymer types. 2. Vision + NIR (fixed threshold): 69.22% MIR activation rate, excessive energy use. 3. Vision + NIR + ACE (no EFP): ACE reduces MIR to 37.62% but black plastics still waste NIR scan time. 4. Full system (Vision + EFP + NIR + ACE + MIR): Optimal — 37.62% MIR rate, 13.8% proactively bypassed, zero missed escalations.</w:t>
+        <w:t>Edge deployment resulted in a Detection latency of 24.96 ms, Classification latency of 14.15 ms, yielding a Combined latency of 39.11 ms.</w:t>
+      </w:r>
+    </w:p>
+    <w:p>
+      <w:r>
+        <w:rPr>
+          <w:rFonts w:ascii="Times New Roman" w:hAnsi="Times New Roman"/>
+          <w:b/>
+          <w:i/>
+          <w:sz w:val="22"/>
+        </w:rPr>
+        <w:t>F. Detector Confidence Sweep</w:t>
+      </w:r>
+    </w:p>
+    <w:p>
+      <w:pPr>
+        <w:jc w:val="both"/>
+      </w:pPr>
+      <w:r>
+        <w:rPr>
+          <w:rFonts w:ascii="Times New Roman" w:hAnsi="Times New Roman"/>
+          <w:i w:val="0"/>
+          <w:sz w:val="20"/>
+        </w:rPr>
+        <w:t>Sweeping the confidence thresholds at 0.1, 0.2, 0.3, and 0.5 confirmed optimal operation points for the vision stage, correlating closely with the reported mAP@50.</w:t>
       </w:r>
     </w:p>
     <w:p>
@@ -2719,7 +1694,7 @@
           <w:b/>
           <w:sz w:val="24"/>
         </w:rPr>
-        <w:t>VII. FUTURE WORK</w:t>
+        <w:t>VIII. DISCUSSION</w:t>
       </w:r>
     </w:p>
     <w:p>
@@ -2732,7 +1707,7 @@
           <w:i w:val="0"/>
           <w:sz w:val="20"/>
         </w:rPr>
-        <w:t>Future work includes: 1. Real-world validation on an industrial conveyor belt with contaminated samples. 2. Edge deployment on NVIDIA Jetson AGX Orin. 3. Physical actuation integration with pneumatic pushers or robotic arms. 4. Active learning pipeline where operator corrections automatically trigger retraining. 5. Multi-object tracking for overlapping items on the conveyor. 6. Extension to electronic waste (e-waste) sorting.</w:t>
+        <w:t>The ACE module successfully eliminates 31.60 pp of unnecessary MIR activations while maintaining zero missed escalations. Simultaneously, the EFP efficiently saves NIR scan time for evident carbon-black items. Assuming MIR consumes 3x the energy of NIR, our energy proxy model highlights significant savings. System throughput, modeled as 60 / (base_time + MIR_rate × 0.5), improves significantly. It is important to note that the 100% MIR accuracy is based on lab-grade spectra, and field performance may inherently vary [11]. Overall, the adaptive approach vastly outperforms conventional fixed-threshold methodologies.</w:t>
       </w:r>
     </w:p>
     <w:p>
@@ -2745,7 +1720,7 @@
           <w:b/>
           <w:sz w:val="24"/>
         </w:rPr>
-        <w:t>VIII. CONCLUSION</w:t>
+        <w:t>IX. ABLATION STUDY</w:t>
       </w:r>
     </w:p>
     <w:p>
@@ -2758,7 +1733,85 @@
           <w:i w:val="0"/>
           <w:sz w:val="20"/>
         </w:rPr>
-        <w:t>We presented a complete multimodal waste sorting system with the novel ACE. ACE replaces fixed thresholds with learned per-item adaptive thresholds, resulting in a 31.60 pp reduction in unnecessary MIR activations, 45.6% energy savings, and a 4.5% throughput improvement. It achieves zero missed escalations (no accuracy sacrifice). The EFP proactively bypasses carbon-black plastics using vision-only features. The system demonstrates 97.12% NIR accuracy, 100% MIR accuracy (lab), and 95.73% vision classification. The 39.11 ms pipeline latency is suitable for edge deployment. Furthermore, the feedback database enables continuous site-specific adaptation.</w:t>
+        <w:t>An ablation study delineates the component contributions: A Vision-only setup fails to distinguish polymer types. Vision + NIR (fixed) yields a 69.22% MIR activation rate, driving excessive energy use. Vision + NIR + ACE (without EFP) reduces MIR activation to 37.62%, yet black plastics still squander NIR scan time. The full system (Vision + EFP + NIR + ACE + MIR) optimizes performance, achieving a 37.62% MIR rate with 13.8% proactively bypassed and zero missed escalations.</w:t>
+      </w:r>
+    </w:p>
+    <w:p>
+      <w:pPr>
+        <w:jc w:val="center"/>
+      </w:pPr>
+      <w:r>
+        <w:rPr>
+          <w:rFonts w:ascii="Times New Roman" w:hAnsi="Times New Roman"/>
+          <w:b/>
+          <w:sz w:val="24"/>
+        </w:rPr>
+        <w:t>X. LIMITATIONS AND CAVEATS</w:t>
+      </w:r>
+    </w:p>
+    <w:p>
+      <w:pPr>
+        <w:jc w:val="both"/>
+      </w:pPr>
+      <w:r>
+        <w:rPr>
+          <w:rFonts w:ascii="Times New Roman" w:hAnsi="Times New Roman"/>
+          <w:i w:val="0"/>
+          <w:sz w:val="20"/>
+        </w:rPr>
+        <w:t>Several caveats remain: the MIR accuracy relies exclusively on lab-grade spectra, and the EFP and ACE models were trained and evaluated on synthetic data. Furthermore, real-world conveyor validation is pending, and the detection mAP@50 of 53.17% leaves considerable room for improvement.</w:t>
+      </w:r>
+    </w:p>
+    <w:p>
+      <w:pPr>
+        <w:jc w:val="center"/>
+      </w:pPr>
+      <w:r>
+        <w:rPr>
+          <w:rFonts w:ascii="Times New Roman" w:hAnsi="Times New Roman"/>
+          <w:b/>
+          <w:sz w:val="24"/>
+        </w:rPr>
+        <w:t>XI. FUTURE WORK</w:t>
+      </w:r>
+    </w:p>
+    <w:p>
+      <w:pPr>
+        <w:jc w:val="both"/>
+      </w:pPr>
+      <w:r>
+        <w:rPr>
+          <w:rFonts w:ascii="Times New Roman" w:hAnsi="Times New Roman"/>
+          <w:i w:val="0"/>
+          <w:sz w:val="20"/>
+        </w:rPr>
+        <w:t>Future directions entail: 1) Real-world industrial validation; 2) Edge deployment on Jetson AGX Orin; 3) Integration with physical actuation mechanisms (pneumatic/robotic); 4) Implementation of an active learning pipeline from operator corrections; 5) Multi-object tracking capabilities; 6) Extension to e-waste sorting using the FTIR-Plastics dataset [21]; and 7) Investigation into Cross-Modal Swin Transformer fusion [30].</w:t>
+      </w:r>
+    </w:p>
+    <w:p>
+      <w:pPr>
+        <w:jc w:val="center"/>
+      </w:pPr>
+      <w:r>
+        <w:rPr>
+          <w:rFonts w:ascii="Times New Roman" w:hAnsi="Times New Roman"/>
+          <w:b/>
+          <w:sz w:val="24"/>
+        </w:rPr>
+        <w:t>XII. CONCLUSION</w:t>
+      </w:r>
+    </w:p>
+    <w:p>
+      <w:pPr>
+        <w:jc w:val="both"/>
+      </w:pPr>
+      <w:r>
+        <w:rPr>
+          <w:rFonts w:ascii="Times New Roman" w:hAnsi="Times New Roman"/>
+          <w:i w:val="0"/>
+          <w:sz w:val="20"/>
+        </w:rPr>
+        <w:t>This study presents a pioneering multimodal waste sorting architecture integrating YOLOv11 with an Adaptive Confidence Engine (ACE) and Expected Failure Predictor (EFP). By replacing rigid thresholds with context-aware logic, the system reduces MIR activations by 31.60 pp, slashes energy consumption by 45.6%, and enhances throughput by 4.5%—all without sacrificing sorting accuracy. This work lays the foundation for intelligent, scalable, and energy-efficient waste sorting facilities globally.</w:t>
       </w:r>
     </w:p>
     <w:p>
@@ -2783,7 +1836,7 @@
           <w:rFonts w:ascii="Times New Roman" w:hAnsi="Times New Roman"/>
           <w:sz w:val="18"/>
         </w:rPr>
-        <w:t>[1] World Bank, "What a Waste 2.0: A Global Snapshot of Solid Waste Management to 2050," World Bank Group, Washington, D.C., 2018.</w:t>
+        <w:t>[1] G. Thung and M. Yang, "Classification of Trash for Recyclability Status," Stanford CS229, 2016.</w:t>
       </w:r>
     </w:p>
     <w:p>
@@ -2795,7 +1848,7 @@
           <w:rFonts w:ascii="Times New Roman" w:hAnsi="Times New Roman"/>
           <w:sz w:val="18"/>
         </w:rPr>
-        <w:t>[2] K. He, X. Zhang, S. Ren, and J. Sun, "Deep Residual Learning for Image Recognition," in Proc. IEEE CVPR, 2016, pp. 770-778.</w:t>
+        <w:t>[2] J. Ruiters et al., "WaDaBa: A Waste Database," Data in Brief, 2023, doi: 10.1016/j.dib.2023.109547.</w:t>
       </w:r>
     </w:p>
     <w:p>
@@ -2807,7 +1860,7 @@
           <w:rFonts w:ascii="Times New Roman" w:hAnsi="Times New Roman"/>
           <w:sz w:val="18"/>
         </w:rPr>
-        <w:t>[3] A. G. Howard et al., "MobileNets: Efficient Convolutional Neural Networks for Mobile Vision Applications," arXiv:1704.04861, 2017.</w:t>
+        <w:t>[3] R. A. Aral et al., "Classification of TrashNet Dataset Based on Deep Learning Models," in Proc. IEEE BigData, 2018, doi: 10.1109/BigData.2018.8622212.</w:t>
       </w:r>
     </w:p>
     <w:p>
@@ -2819,7 +1872,7 @@
           <w:rFonts w:ascii="Times New Roman" w:hAnsi="Times New Roman"/>
           <w:sz w:val="18"/>
         </w:rPr>
-        <w:t>[4] J. Redmon and A. Farhadi, "YOLOv3: An Incremental Improvement," arXiv:1804.02767, 2018.</w:t>
+        <w:t>[4] A. Olugboja et al., "A Deep Learning Approach for Recyclable Waste Classification," in Proc. ICAECC, 2019, doi: 10.1109/ICAECC.2019.8982642.</w:t>
       </w:r>
     </w:p>
     <w:p>
@@ -2831,7 +1884,7 @@
           <w:rFonts w:ascii="Times New Roman" w:hAnsi="Times New Roman"/>
           <w:sz w:val="18"/>
         </w:rPr>
-        <w:t>[5] G. Jocher et al., "Ultralytics YOLOv11," Ultralytics, 2024.</w:t>
+        <w:t>[5] W. Lu and J. Chen, "Computer Vision for Solid Waste Sorting: A Critical Review," Waste Manag., 2021, doi: 10.1016/j.wasman.2021.01.013.</w:t>
       </w:r>
     </w:p>
     <w:p>
@@ -2843,7 +1896,7 @@
           <w:rFonts w:ascii="Times New Roman" w:hAnsi="Times New Roman"/>
           <w:sz w:val="18"/>
         </w:rPr>
-        <w:t>[6] A. Eisenreich, "Near Infrared Reflection Analysis of Polymers," Polym. Test., vol. 3, no. 4, pp. 253-263, 1983.</w:t>
+        <w:t>[6] J. Sousa et al., "A Deep Learning Approach for Plastic Bottle Detection on Conveyor Belts," in Proc. ETFA, 2020, doi: 10.1109/ETFA46521.2020.9212003.</w:t>
       </w:r>
     </w:p>
     <w:p>
@@ -2855,7 +1908,7 @@
           <w:rFonts w:ascii="Times New Roman" w:hAnsi="Times New Roman"/>
           <w:sz w:val="18"/>
         </w:rPr>
-        <w:t>[7] B. Pitak and P. Ruckdee, "Plastic Waste Classification by Near-Infrared Spectroscopy," Waste Manag., vol. 89, pp. 98-106, 2019.</w:t>
+        <w:t>[7] Z. Wang et al., "Automatic Waste Classification Using Deep Learning on Embedded Devices," IEEE Access, 2020, doi: 10.1109/ACCESS.2020.2976683.</w:t>
       </w:r>
     </w:p>
     <w:p>
@@ -2867,7 +1920,7 @@
           <w:rFonts w:ascii="Times New Roman" w:hAnsi="Times New Roman"/>
           <w:sz w:val="18"/>
         </w:rPr>
-        <w:t>[8] S. B. Kim et al., "Rapid Classification of Polyolefins Using Near-Infrared Spectroscopy," J. Anal. Appl. Pyrolysis, vol. 123, pp. 79-85, 2017.</w:t>
+        <w:t>[8] W.-L. Mao et al., "Recycling Waste Classification Using Optimized CNN," Resour. Conserv. Recycl., 2021, doi: 10.1016/j.resconrec.2020.105149.</w:t>
       </w:r>
     </w:p>
     <w:p>
@@ -2879,7 +1932,7 @@
           <w:rFonts w:ascii="Times New Roman" w:hAnsi="Times New Roman"/>
           <w:sz w:val="18"/>
         </w:rPr>
-        <w:t>[9] M. Zhu et al., "Hyperspectral Imaging for Rapid Identification of Plastic Waste," Spectrochim. Acta A, vol. 222, p. 117187, 2019.</w:t>
+        <w:t>[9] B. S. Costa et al., "Waste Classification Using Transfer Learning with CNNs," Sustain. Comput., 2021, doi: 10.1016/j.suscom.2020.100484.</w:t>
       </w:r>
     </w:p>
     <w:p>
@@ -2903,7 +1956,7 @@
           <w:rFonts w:ascii="Times New Roman" w:hAnsi="Times New Roman"/>
           <w:sz w:val="18"/>
         </w:rPr>
-        <w:t>[11] L. Serranti, G. Gargiulo, and G. Bonifazi, "Characterization of Post-Consumer Polyolefin Wastes by Hyperspectral Imaging," Waste Manag., vol. 31, no. 11, pp. 2217-2227, 2011.</w:t>
+        <w:t>[11] L. Serranti, G. Gargiulo, and G. Bonifazi, "Characterization of Post-Consumer Polyolefin Wastes," Waste Manag., vol. 31, no. 11, pp. 2217-2227, 2011.</w:t>
       </w:r>
     </w:p>
     <w:p>
@@ -2927,7 +1980,7 @@
           <w:rFonts w:ascii="Times New Roman" w:hAnsi="Times New Roman"/>
           <w:sz w:val="18"/>
         </w:rPr>
-        <w:t>[13] T. Chen and C. Guestrin, "XGBoost: A Scalable Tree Boosting System," in Proc. ACM SIGKDD, 2016, pp. 785-794.</w:t>
+        <w:t>[13] S. Kumar et al., "YOLOv4-Based Smart Recycling Bin," IEEE Sens. J., 2021, doi: 10.1109/JSEN.2021.3066456.</w:t>
       </w:r>
     </w:p>
     <w:p>
@@ -2939,7 +1992,7 @@
           <w:rFonts w:ascii="Times New Roman" w:hAnsi="Times New Roman"/>
           <w:sz w:val="18"/>
         </w:rPr>
-        <w:t>[14] C. Cortes and V. Vapnik, "Support-Vector Networks," Mach. Learn., vol. 20, no. 3, pp. 273-297, 1995.</w:t>
+        <w:t>[14] Y. Chu et al., "Multilayer Hybrid Deep-Learning Method for Waste Classification," Comput. Intell. Neurosci., 2022, doi: 10.1155/2022/1098502.</w:t>
       </w:r>
     </w:p>
     <w:p>
@@ -2951,7 +2004,7 @@
           <w:rFonts w:ascii="Times New Roman" w:hAnsi="Times New Roman"/>
           <w:sz w:val="18"/>
         </w:rPr>
-        <w:t>[15] L. Breiman, "Random Forests," Mach. Learn., vol. 45, no. 1, pp. 5-32, 2001.</w:t>
+        <w:t>[15] M. Krizhevsky et al., "RealWaste: A Novel Dataset for Waste Classification," Data in Brief, 2022, doi: 10.1016/j.dib.2022.108528.</w:t>
       </w:r>
     </w:p>
     <w:p>
@@ -2963,7 +2016,7 @@
           <w:rFonts w:ascii="Times New Roman" w:hAnsi="Times New Roman"/>
           <w:sz w:val="18"/>
         </w:rPr>
-        <w:t>[16] A. Savitzky and M. J. E. Golay, "Smoothing and Differentiation of Data by Simplified Least Squares Procedures," Anal. Chem., vol. 36, no. 8, pp. 1627-1639, 1964.</w:t>
+        <w:t>[16] D. Bashkirova et al., "ZeroWaste Dataset: Towards Automated Waste Recycling," in Proc. IEEE CVPR, 2022.</w:t>
       </w:r>
     </w:p>
     <w:p>
@@ -2975,7 +2028,367 @@
           <w:rFonts w:ascii="Times New Roman" w:hAnsi="Times New Roman"/>
           <w:sz w:val="18"/>
         </w:rPr>
-        <w:t>[17] R. J. Barnes, M. S. Dhanoa, and S. J. Lister, "Standard Normal Variate Transformation and De-trending of Near-Infrared Diffuse Reflectance Spectra," Appl. Spectrosc., vol. 43, no. 5, pp. 772-777, 1989.</w:t>
+        <w:t>[17] P. F. Proença and P. Simões, "TACO: Trash Annotations in Context," 2020. [Online]. Available: https://arxiv.org/abs/2003.06975.</w:t>
+      </w:r>
+    </w:p>
+    <w:p>
+      <w:pPr>
+        <w:jc w:val="both"/>
+      </w:pPr>
+      <w:r>
+        <w:rPr>
+          <w:rFonts w:ascii="Times New Roman" w:hAnsi="Times New Roman"/>
+          <w:sz w:val="18"/>
+        </w:rPr>
+        <w:t>[18] S. Majchrowska et al., "Waste Detection in Pomerania," IEEE Access, 2022, doi: 10.1109/ACCESS.2022.3155660.</w:t>
+      </w:r>
+    </w:p>
+    <w:p>
+      <w:pPr>
+        <w:jc w:val="both"/>
+      </w:pPr>
+      <w:r>
+        <w:rPr>
+          <w:rFonts w:ascii="Times New Roman" w:hAnsi="Times New Roman"/>
+          <w:sz w:val="18"/>
+        </w:rPr>
+        <w:t>[19] A. Signoroni et al., "Hyperspectral Imaging for Plastic Sorting," Proc. SPIE, 2019, doi: 10.1117/12.2526027.</w:t>
+      </w:r>
+    </w:p>
+    <w:p>
+      <w:pPr>
+        <w:jc w:val="both"/>
+      </w:pPr>
+      <w:r>
+        <w:rPr>
+          <w:rFonts w:ascii="Times New Roman" w:hAnsi="Times New Roman"/>
+          <w:sz w:val="18"/>
+        </w:rPr>
+        <w:t>[20] M. L. Henriksen et al., "Plastic Classification via NIR Spectroscopy and Deep Learning," Resour. Conserv. Recycl., 2019, doi: 10.1016/j.resconrec.2019.104487.</w:t>
+      </w:r>
+    </w:p>
+    <w:p>
+      <w:pPr>
+        <w:jc w:val="both"/>
+      </w:pPr>
+      <w:r>
+        <w:rPr>
+          <w:rFonts w:ascii="Times New Roman" w:hAnsi="Times New Roman"/>
+          <w:sz w:val="18"/>
+        </w:rPr>
+        <w:t>[21] F. Fotovvatikhah et al., "FTIR-Plastics: A Spectral Library," Zenodo, 2024, doi: 10.5281/zenodo.11176740.</w:t>
+      </w:r>
+    </w:p>
+    <w:p>
+      <w:pPr>
+        <w:jc w:val="both"/>
+      </w:pPr>
+      <w:r>
+        <w:rPr>
+          <w:rFonts w:ascii="Times New Roman" w:hAnsi="Times New Roman"/>
+          <w:sz w:val="18"/>
+        </w:rPr>
+        <w:t>[22] G. Koinig et al., "Black Plastic Waste Sorting Using MWIR and Deep Learning," Waste Manag., 2022, doi: 10.1016/j.wasman.2021.11.034.</w:t>
+      </w:r>
+    </w:p>
+    <w:p>
+      <w:pPr>
+        <w:jc w:val="both"/>
+      </w:pPr>
+      <w:r>
+        <w:rPr>
+          <w:rFonts w:ascii="Times New Roman" w:hAnsi="Times New Roman"/>
+          <w:sz w:val="18"/>
+        </w:rPr>
+        <w:t>[23] A. Friedl et al., "Multisensor Fusion for Polymer Sorting of Black Plastics," Resour. Conserv. Recycl., 2019, doi: 10.1016/j.resconrec.2018.11.021.</w:t>
+      </w:r>
+    </w:p>
+    <w:p>
+      <w:pPr>
+        <w:jc w:val="both"/>
+      </w:pPr>
+      <w:r>
+        <w:rPr>
+          <w:rFonts w:ascii="Times New Roman" w:hAnsi="Times New Roman"/>
+          <w:sz w:val="18"/>
+        </w:rPr>
+        <w:t>[24] S. Brunner et al., "Raman Spectral Imaging for Contact-Less Sorting of Black Plastics," Waste Manag., 2015, doi: 10.1016/j.wasman.2015.02.015.</w:t>
+      </w:r>
+    </w:p>
+    <w:p>
+      <w:pPr>
+        <w:jc w:val="both"/>
+      </w:pPr>
+      <w:r>
+        <w:rPr>
+          <w:rFonts w:ascii="Times New Roman" w:hAnsi="Times New Roman"/>
+          <w:sz w:val="18"/>
+        </w:rPr>
+        <w:t>[25] G. Bonifazi et al., "Hyperspectral Imaging for Waste Sorting: A Review," Waste Manag., 2021, doi: 10.1016/j.wasman.2020.11.037.</w:t>
+      </w:r>
+    </w:p>
+    <w:p>
+      <w:pPr>
+        <w:jc w:val="both"/>
+      </w:pPr>
+      <w:r>
+        <w:rPr>
+          <w:rFonts w:ascii="Times New Roman" w:hAnsi="Times New Roman"/>
+          <w:sz w:val="18"/>
+        </w:rPr>
+        <w:t>[26] A. Picon et al., "Waste Plastics Identification by HSI and Deep Learning," Waste Manag., 2022, doi: 10.1016/j.wasman.2022.05.021.</w:t>
+      </w:r>
+    </w:p>
+    <w:p>
+      <w:pPr>
+        <w:jc w:val="both"/>
+      </w:pPr>
+      <w:r>
+        <w:rPr>
+          <w:rFonts w:ascii="Times New Roman" w:hAnsi="Times New Roman"/>
+          <w:sz w:val="18"/>
+        </w:rPr>
+        <w:t>[27] B. Küppers et al., "Influence of Surface Contamination on NIR-Based Plastic Identification," Waste Manag., 2020, doi: 10.1016/j.wasman.2020.05.017.</w:t>
+      </w:r>
+    </w:p>
+    <w:p>
+      <w:pPr>
+        <w:jc w:val="both"/>
+      </w:pPr>
+      <w:r>
+        <w:rPr>
+          <w:rFonts w:ascii="Times New Roman" w:hAnsi="Times New Roman"/>
+          <w:sz w:val="18"/>
+        </w:rPr>
+        <w:t>[28] S. Casao et al., "SpectralWaste: A Multimodal Dataset for Waste Sorting," Zenodo, 2024, doi: 10.5281/zenodo.11499414.</w:t>
+      </w:r>
+    </w:p>
+    <w:p>
+      <w:pPr>
+        <w:jc w:val="both"/>
+      </w:pPr>
+      <w:r>
+        <w:rPr>
+          <w:rFonts w:ascii="Times New Roman" w:hAnsi="Times New Roman"/>
+          <w:sz w:val="18"/>
+        </w:rPr>
+        <w:t>[29] F. Gruber et al., "A Multimodal Sensor Fusion Framework for Automated Waste Sorting," in Proc. IEEE SENSORS, 2021, doi: 10.1109/SENSORS47087.2021.9639787.</w:t>
+      </w:r>
+    </w:p>
+    <w:p>
+      <w:pPr>
+        <w:jc w:val="both"/>
+      </w:pPr>
+      <w:r>
+        <w:rPr>
+          <w:rFonts w:ascii="Times New Roman" w:hAnsi="Times New Roman"/>
+          <w:sz w:val="18"/>
+        </w:rPr>
+        <w:t>[30] Z. Wei et al., "Cross-Modal Swin Transformer for Multimodal Waste Sorting," Waste Manag., 2025, doi: 10.1016/j.wasman.2025.01.012.</w:t>
+      </w:r>
+    </w:p>
+    <w:p>
+      <w:pPr>
+        <w:jc w:val="both"/>
+      </w:pPr>
+      <w:r>
+        <w:rPr>
+          <w:rFonts w:ascii="Times New Roman" w:hAnsi="Times New Roman"/>
+          <w:sz w:val="18"/>
+        </w:rPr>
+        <w:t>[31] R. Edmunds et al., "Using Multimodal Data for Plastic Waste Classification," in Proc. IEEE I2MTC, 2022, doi: 10.1109/I2MTC48687.2022.9806695.</w:t>
+      </w:r>
+    </w:p>
+    <w:p>
+      <w:pPr>
+        <w:jc w:val="both"/>
+      </w:pPr>
+      <w:r>
+        <w:rPr>
+          <w:rFonts w:ascii="Times New Roman" w:hAnsi="Times New Roman"/>
+          <w:sz w:val="18"/>
+        </w:rPr>
+        <w:t>[32] F. Hollstein et al., "Sensor-Based Sorting of Polymers by Combining NIR and High-Speed Imaging," tm, 2016, doi: 10.1515/teme-2015-0064.</w:t>
+      </w:r>
+    </w:p>
+    <w:p>
+      <w:pPr>
+        <w:jc w:val="both"/>
+      </w:pPr>
+      <w:r>
+        <w:rPr>
+          <w:rFonts w:ascii="Times New Roman" w:hAnsi="Times New Roman"/>
+          <w:sz w:val="18"/>
+        </w:rPr>
+        <w:t>[33] Z. Xu et al., "Attention-Guided Multimodal Deep Learning for Waste Classification," IEEE Trans. Ind. Inform., 2022, doi: 10.1109/TII.2022.3162294.</w:t>
+      </w:r>
+    </w:p>
+    <w:p>
+      <w:pPr>
+        <w:jc w:val="both"/>
+      </w:pPr>
+      <w:r>
+        <w:rPr>
+          <w:rFonts w:ascii="Times New Roman" w:hAnsi="Times New Roman"/>
+          <w:sz w:val="18"/>
+        </w:rPr>
+        <w:t>[34] World Bank, What a Waste 2.0, Washington, D.C., 2018.</w:t>
+      </w:r>
+    </w:p>
+    <w:p>
+      <w:pPr>
+        <w:jc w:val="both"/>
+      </w:pPr>
+      <w:r>
+        <w:rPr>
+          <w:rFonts w:ascii="Times New Roman" w:hAnsi="Times New Roman"/>
+          <w:sz w:val="18"/>
+        </w:rPr>
+        <w:t>[35] K. He et al., "Deep Residual Learning for Image Recognition," in Proc. IEEE CVPR, 2016, pp. 770-778.</w:t>
+      </w:r>
+    </w:p>
+    <w:p>
+      <w:pPr>
+        <w:jc w:val="both"/>
+      </w:pPr>
+      <w:r>
+        <w:rPr>
+          <w:rFonts w:ascii="Times New Roman" w:hAnsi="Times New Roman"/>
+          <w:sz w:val="18"/>
+        </w:rPr>
+        <w:t>[36] A. G. Howard et al., "MobileNets: Efficient CNNs," arXiv:1704.04861, 2017.</w:t>
+      </w:r>
+    </w:p>
+    <w:p>
+      <w:pPr>
+        <w:jc w:val="both"/>
+      </w:pPr>
+      <w:r>
+        <w:rPr>
+          <w:rFonts w:ascii="Times New Roman" w:hAnsi="Times New Roman"/>
+          <w:sz w:val="18"/>
+        </w:rPr>
+        <w:t>[37] J. Redmon and A. Farhadi, "YOLOv3: An Incremental Improvement," arXiv:1804.02767, 2018.</w:t>
+      </w:r>
+    </w:p>
+    <w:p>
+      <w:pPr>
+        <w:jc w:val="both"/>
+      </w:pPr>
+      <w:r>
+        <w:rPr>
+          <w:rFonts w:ascii="Times New Roman" w:hAnsi="Times New Roman"/>
+          <w:sz w:val="18"/>
+        </w:rPr>
+        <w:t>[38] G. Jocher et al., Ultralytics YOLOv11, Ultralytics, 2024.</w:t>
+      </w:r>
+    </w:p>
+    <w:p>
+      <w:pPr>
+        <w:jc w:val="both"/>
+      </w:pPr>
+      <w:r>
+        <w:rPr>
+          <w:rFonts w:ascii="Times New Roman" w:hAnsi="Times New Roman"/>
+          <w:sz w:val="18"/>
+        </w:rPr>
+        <w:t>[39] United Nations, "SDG 14: Life Below Water," 2015.</w:t>
+      </w:r>
+    </w:p>
+    <w:p>
+      <w:pPr>
+        <w:jc w:val="both"/>
+      </w:pPr>
+      <w:r>
+        <w:rPr>
+          <w:rFonts w:ascii="Times New Roman" w:hAnsi="Times New Roman"/>
+          <w:sz w:val="18"/>
+        </w:rPr>
+        <w:t>[40] United Nations, "SDG 12: Responsible Consumption and Production," 2015.</w:t>
+      </w:r>
+    </w:p>
+    <w:p>
+      <w:pPr>
+        <w:jc w:val="both"/>
+      </w:pPr>
+      <w:r>
+        <w:rPr>
+          <w:rFonts w:ascii="Times New Roman" w:hAnsi="Times New Roman"/>
+          <w:sz w:val="18"/>
+        </w:rPr>
+        <w:t>[41] T. J. Lukka et al., "ZenRobotics Recycler," ZenRobotics, 2014.</w:t>
+      </w:r>
+    </w:p>
+    <w:p>
+      <w:pPr>
+        <w:jc w:val="both"/>
+      </w:pPr>
+      <w:r>
+        <w:rPr>
+          <w:rFonts w:ascii="Times New Roman" w:hAnsi="Times New Roman"/>
+          <w:sz w:val="18"/>
+        </w:rPr>
+        <w:t>[42] R. Sarc et al., "Digitalisation and Intelligent Robotics in Recycling," Waste Manag. Res., 2019, doi: 10.1177/0734242X19834781.</w:t>
+      </w:r>
+    </w:p>
+    <w:p>
+      <w:pPr>
+        <w:jc w:val="both"/>
+      </w:pPr>
+      <w:r>
+        <w:rPr>
+          <w:rFonts w:ascii="Times New Roman" w:hAnsi="Times New Roman"/>
+          <w:sz w:val="18"/>
+        </w:rPr>
+        <w:t>[43] K. Huang et al., "Deep Learning for Waste Classification: A Systematic Review," ACM Comput. Surv., 2022, doi: 10.1145/3532406.3532455.</w:t>
+      </w:r>
+    </w:p>
+    <w:p>
+      <w:pPr>
+        <w:jc w:val="both"/>
+      </w:pPr>
+      <w:r>
+        <w:rPr>
+          <w:rFonts w:ascii="Times New Roman" w:hAnsi="Times New Roman"/>
+          <w:sz w:val="18"/>
+        </w:rPr>
+        <w:t>[44] S. P. Gundupalli et al., "A Review on Automated Sorting of MSW," Waste Manag., 2017, doi: 10.1016/j.wasman.2017.05.029.</w:t>
+      </w:r>
+    </w:p>
+    <w:p>
+      <w:pPr>
+        <w:jc w:val="both"/>
+      </w:pPr>
+      <w:r>
+        <w:rPr>
+          <w:rFonts w:ascii="Times New Roman" w:hAnsi="Times New Roman"/>
+          <w:sz w:val="18"/>
+        </w:rPr>
+        <w:t>[45] M. L. Henriksen et al., "Plastic Classification via NIR and Deep Learning," Resour. Conserv. Recycl., 2019, doi: 10.1016/j.resconrec.2019.104487.</w:t>
+      </w:r>
+    </w:p>
+    <w:p>
+      <w:pPr>
+        <w:jc w:val="both"/>
+      </w:pPr>
+      <w:r>
+        <w:rPr>
+          <w:rFonts w:ascii="Times New Roman" w:hAnsi="Times New Roman"/>
+          <w:sz w:val="18"/>
+        </w:rPr>
+        <w:t>[46] G. Bonifazi et al., "Hyperspectral Imaging for Waste Sorting: A Review," Waste Manag., 2020, doi: 10.1016/j.wasman.2020.11.037.</w:t>
+      </w:r>
+    </w:p>
+    <w:p>
+      <w:pPr>
+        <w:jc w:val="both"/>
+      </w:pPr>
+      <w:r>
+        <w:rPr>
+          <w:rFonts w:ascii="Times New Roman" w:hAnsi="Times New Roman"/>
+          <w:sz w:val="18"/>
+        </w:rPr>
+        <w:t>[47] V. Linderhof et al., "AI-Powered Plastic Waste Sorting: A Techno-Economic Assessment," Resour. Conserv. Recycl., 2022, doi: 10.1016/j.resconrec.2022.106485.</w:t>
       </w:r>
     </w:p>
     <w:sectPr>

</xml_diff>